<commit_message>
Polish supervisor docs after sync: fix stale README spots, add titles-only clarification to meeting outline
</commit_message>
<xml_diff>
--- a/thesis_writeup/supervisor_materials_20260530/meeting_outline_2026-05-30.docx
+++ b/thesis_writeup/supervisor_materials_20260530/meeting_outline_2026-05-30.docx
@@ -3,287 +3,350 @@
 <w:document xmlns:wpc="http://schemas.microsoft.com/office/word/2010/wordprocessingCanvas" xmlns:mo="http://schemas.microsoft.com/office/mac/office/2008/main" xmlns:mc="http://schemas.openxmlformats.org/markup-compatibility/2006" xmlns:mv="urn:schemas-microsoft-com:mac:vml" xmlns:o="urn:schemas-microsoft-com:office:office" xmlns:r="http://schemas.openxmlformats.org/officeDocument/2006/relationships" xmlns:m="http://schemas.openxmlformats.org/officeDocument/2006/math" xmlns:v="urn:schemas-microsoft-com:vml" xmlns:wp14="http://schemas.microsoft.com/office/word/2010/wordprocessingDrawing" xmlns:wp="http://schemas.openxmlformats.org/drawingml/2006/wordprocessingDrawing" xmlns:w10="urn:schemas-microsoft-com:office:word" xmlns:w="http://schemas.openxmlformats.org/wordprocessingml/2006/main" xmlns:w14="http://schemas.microsoft.com/office/word/2010/wordml" xmlns:wpg="http://schemas.microsoft.com/office/word/2010/wordprocessingGroup" xmlns:wpi="http://schemas.microsoft.com/office/word/2010/wordprocessingInk" xmlns:wne="http://schemas.microsoft.com/office/word/2006/wordml" xmlns:wps="http://schemas.microsoft.com/office/word/2010/wordprocessingShape" mc:Ignorable="w14 wp14">
   <w:body>
     <w:p>
-      <w:pPr>
-        <w:pStyle w:val="Title"/>
-        <w:jc w:val="center"/>
-      </w:pPr>
       <w:r>
+        <w:rPr>
+          <w:rFonts w:ascii="微软雅黑" w:hAnsi="微软雅黑" w:eastAsia="微软雅黑"/>
+          <w:b/>
+          <w:color w:val="1F3A5F"/>
+          <w:sz w:val="36"/>
+        </w:rPr>
         <w:t>Supervisor Meeting Outline - 2026-05-30 14:30</w:t>
       </w:r>
     </w:p>
     <w:p>
-      <w:pPr>
-        <w:spacing w:after="20"/>
-      </w:pPr>
       <w:r>
+        <w:rPr>
+          <w:rFonts w:ascii="微软雅黑" w:hAnsi="微软雅黑" w:eastAsia="微软雅黑"/>
+        </w:rPr>
         <w:t>Opening sentence:</w:t>
       </w:r>
     </w:p>
     <w:p>
-      <w:pPr>
-        <w:spacing w:after="20"/>
-      </w:pPr>
       <w:r>
+        <w:rPr>
+          <w:rFonts w:ascii="微软雅黑" w:hAnsi="微软雅黑" w:eastAsia="微软雅黑"/>
+        </w:rPr>
         <w:t>I have checked the rerun evidence and updated the supervisor-facing material. The key point is no longer "I ran some experiments", but "I verified which results are stable, which ones are still uncertain, and where I need your judgement for the next step."</w:t>
       </w:r>
     </w:p>
     <w:p>
-      <w:pPr>
-        <w:pStyle w:val="Heading2"/>
-        <w:spacing w:before="100" w:after="20"/>
-      </w:pPr>
       <w:r>
+        <w:rPr>
+          <w:rFonts w:ascii="微软雅黑" w:hAnsi="微软雅黑" w:eastAsia="微软雅黑"/>
+          <w:b/>
+          <w:color w:val="1F3A5F"/>
+          <w:sz w:val="28"/>
+        </w:rPr>
         <w:t>1. Completed Reruns</w:t>
       </w:r>
     </w:p>
     <w:p>
       <w:pPr>
         <w:pStyle w:val="ListBullet"/>
-        <w:spacing w:after="0"/>
-        <w:ind w:left="216"/>
       </w:pPr>
       <w:r>
+        <w:rPr>
+          <w:rFonts w:ascii="微软雅黑" w:hAnsi="微软雅黑" w:eastAsia="微软雅黑"/>
+        </w:rPr>
         <w:t>Titles-only direct transfer baseline: reran Weighted RoBERTa from LIAR to held-out FakeNewsNet titles with 5 seeds: 42, 52, 62, 72, 82.</w:t>
       </w:r>
     </w:p>
     <w:p>
       <w:pPr>
         <w:pStyle w:val="ListBullet"/>
-        <w:spacing w:after="0"/>
-        <w:ind w:left="216"/>
       </w:pPr>
       <w:r>
+        <w:rPr>
+          <w:rFonts w:ascii="微软雅黑" w:hAnsi="微软雅黑" w:eastAsia="微软雅黑"/>
+        </w:rPr>
         <w:t>Intermediate fine-tuning 10%: reran LIAR -&gt; stratified 10% FakeNewsNet target-train titles -&gt; held-out FakeNewsNet title test with the same 5 seeds.</w:t>
       </w:r>
     </w:p>
     <w:p>
       <w:pPr>
         <w:pStyle w:val="ListBullet"/>
-        <w:spacing w:after="0"/>
-        <w:ind w:left="216"/>
       </w:pPr>
       <w:r>
+        <w:rPr>
+          <w:rFonts w:ascii="微软雅黑" w:hAnsi="微软雅黑" w:eastAsia="微软雅黑"/>
+        </w:rPr>
         <w:t>Intermediate fine-tuning 20%: reran LIAR -&gt; stratified 20% FakeNewsNet target-train titles -&gt; held-out FakeNewsNet title test with the same 5 seeds.</w:t>
       </w:r>
     </w:p>
     <w:p>
       <w:pPr>
         <w:pStyle w:val="ListBullet"/>
-        <w:spacing w:after="0"/>
-        <w:ind w:left="216"/>
       </w:pPr>
       <w:r>
+        <w:rPr>
+          <w:rFonts w:ascii="微软雅黑" w:hAnsi="微软雅黑" w:eastAsia="微软雅黑"/>
+        </w:rPr>
         <w:t>Dataset-shift analysis: produced short explanatory evidence on LIAR vs FakeNewsNet title length, vocabulary overlap, and dataset-distinctive terms.</w:t>
       </w:r>
     </w:p>
     <w:p>
       <w:pPr>
         <w:pStyle w:val="ListBullet"/>
-        <w:spacing w:after="0"/>
-        <w:ind w:left="216"/>
       </w:pPr>
       <w:r>
+        <w:rPr>
+          <w:rFonts w:ascii="微软雅黑" w:hAnsi="微软雅黑" w:eastAsia="微软雅黑"/>
+        </w:rPr>
         <w:t>LLM/DeepSeek atom pilot: kept as a 1000-row exploratory pilot only. The safe wording is that the current DeepSeek V4 Flash reasoning-atom setup shows limited performance in this pilot.</w:t>
       </w:r>
     </w:p>
     <w:p>
-      <w:pPr>
-        <w:pStyle w:val="Heading2"/>
-        <w:spacing w:before="100" w:after="20"/>
-      </w:pPr>
       <w:r>
+        <w:rPr>
+          <w:rFonts w:ascii="微软雅黑" w:hAnsi="微软雅黑" w:eastAsia="微软雅黑"/>
+          <w:b/>
+          <w:color w:val="1F3A5F"/>
+          <w:sz w:val="28"/>
+        </w:rPr>
         <w:t>2. Main Findings</w:t>
       </w:r>
     </w:p>
     <w:p>
       <w:pPr>
         <w:pStyle w:val="ListBullet"/>
-        <w:spacing w:after="0"/>
-        <w:ind w:left="216"/>
       </w:pPr>
       <w:r>
+        <w:rPr>
+          <w:rFonts w:ascii="微软雅黑" w:hAnsi="微软雅黑" w:eastAsia="微软雅黑"/>
+        </w:rPr>
         <w:t>Direct titles-only transfer is consistently weak, not just unlucky seed 42: 5-seed mean Macro-F1 is 0.2364, with very low REAL recall and high FAKE recall.</w:t>
       </w:r>
     </w:p>
     <w:p>
       <w:pPr>
         <w:pStyle w:val="ListBullet"/>
-        <w:spacing w:after="0"/>
-        <w:ind w:left="216"/>
       </w:pPr>
       <w:r>
+        <w:rPr>
+          <w:rFonts w:ascii="微软雅黑" w:hAnsi="微软雅黑" w:eastAsia="微软雅黑"/>
+        </w:rPr>
         <w:t>10% intermediate fine-tuning is a stable data-efficient improvement: 5-seed mean Macro-F1 is 0.7035, compared with 0.2364 for source-only direct transfer.</w:t>
       </w:r>
     </w:p>
     <w:p>
       <w:pPr>
         <w:pStyle w:val="ListBullet"/>
-        <w:spacing w:after="0"/>
-        <w:ind w:left="216"/>
       </w:pPr>
       <w:r>
+        <w:rPr>
+          <w:rFonts w:ascii="微软雅黑" w:hAnsi="微软雅黑" w:eastAsia="微软雅黑"/>
+        </w:rPr>
         <w:t>20% intermediate fine-tuning is now the strongest absolute 5-seed target-fraction result: mean Macro-F1 is 0.7463, Accuracy is 0.8243, REAL recall is 0.9167, and FAKE recall is 0.5444.</w:t>
       </w:r>
     </w:p>
     <w:p>
       <w:pPr>
         <w:pStyle w:val="ListBullet"/>
-        <w:spacing w:after="0"/>
-        <w:ind w:left="216"/>
       </w:pPr>
       <w:r>
+        <w:rPr>
+          <w:rFonts w:ascii="微软雅黑" w:hAnsi="微软雅黑" w:eastAsia="微软雅黑"/>
+        </w:rPr>
         <w:t>The 10% subset is stratified target-title training, not 1:1 balanced sampling. I have corrected the wording in the results table and Chapter 3 terminology.</w:t>
       </w:r>
     </w:p>
     <w:p>
       <w:pPr>
         <w:pStyle w:val="ListBullet"/>
-        <w:spacing w:after="0"/>
-        <w:ind w:left="216"/>
       </w:pPr>
       <w:r>
+        <w:rPr>
+          <w:rFonts w:ascii="微软雅黑" w:hAnsi="微软雅黑" w:eastAsia="微软雅黑"/>
+        </w:rPr>
         <w:t>The dataset-shift analysis supports the explanation: LIAR statements and FakeNewsNet titles differ in length, vocabulary, topic, and class distribution.</w:t>
       </w:r>
     </w:p>
     <w:p>
-      <w:pPr>
-        <w:pStyle w:val="Heading2"/>
-        <w:spacing w:before="100" w:after="20"/>
-      </w:pPr>
       <w:r>
+        <w:rPr>
+          <w:rFonts w:ascii="微软雅黑" w:hAnsi="微软雅黑" w:eastAsia="微软雅黑"/>
+          <w:b/>
+          <w:color w:val="1F3A5F"/>
+          <w:sz w:val="28"/>
+        </w:rPr>
         <w:t>3. Still Uncertain</w:t>
       </w:r>
     </w:p>
     <w:p>
       <w:pPr>
         <w:pStyle w:val="ListBullet"/>
-        <w:spacing w:after="0"/>
-        <w:ind w:left="216"/>
       </w:pPr>
       <w:r>
+        <w:rPr>
+          <w:rFonts w:ascii="微软雅黑" w:hAnsi="微软雅黑" w:eastAsia="微软雅黑"/>
+        </w:rPr>
         <w:t>The 5% intermediate fine-tuning row is also seed 42 only and collapses to almost all REAL predictions, so it is not a stable claim.</w:t>
       </w:r>
     </w:p>
     <w:p>
       <w:pPr>
         <w:pStyle w:val="ListBullet"/>
-        <w:spacing w:after="0"/>
-        <w:ind w:left="216"/>
       </w:pPr>
       <w:r>
+        <w:rPr>
+          <w:rFonts w:ascii="微软雅黑" w:hAnsi="微软雅黑" w:eastAsia="微软雅黑"/>
+        </w:rPr>
+        <w:t>Note on "titles vs full text": FakeNewsNet Minimal provides titles only, with no article body text available locally, so there is no full-body version to compare against. The two numbers seen previously (held-out title test 0.2364 vs combined titles 0.2358) are both title-based and effectively the same. The transfer experiment is therefore a LIAR-statement to FakeNewsNet-title setting, not full-article detection.</w:t>
+      </w:r>
+    </w:p>
+    <w:p>
+      <w:pPr>
+        <w:pStyle w:val="ListBullet"/>
+      </w:pPr>
+      <w:r>
+        <w:rPr>
+          <w:rFonts w:ascii="微软雅黑" w:hAnsi="微软雅黑" w:eastAsia="微软雅黑"/>
+        </w:rPr>
         <w:t>The main framing choice is now between emphasizing 10% as the efficient adaptation result or 20% as the best absolute result.</w:t>
       </w:r>
     </w:p>
     <w:p>
       <w:pPr>
         <w:pStyle w:val="ListBullet"/>
-        <w:spacing w:after="0"/>
-        <w:ind w:left="216"/>
       </w:pPr>
       <w:r>
+        <w:rPr>
+          <w:rFonts w:ascii="微软雅黑" w:hAnsi="微软雅黑" w:eastAsia="微软雅黑"/>
+        </w:rPr>
         <w:t>The 1000-row LLM/DeepSeek atom pilot is one sample only. It can support motivation, but it should not be used as a main empirical conclusion.</w:t>
       </w:r>
     </w:p>
     <w:p>
       <w:pPr>
         <w:pStyle w:val="ListBullet"/>
-        <w:spacing w:after="0"/>
-        <w:ind w:left="216"/>
       </w:pPr>
       <w:r>
+        <w:rPr>
+          <w:rFonts w:ascii="微软雅黑" w:hAnsi="微软雅黑" w:eastAsia="微软雅黑"/>
+        </w:rPr>
         <w:t>Chapter 6 can be internally updated, but Chapter 2/3 plus the compact result summary are better for supervisor review first.</w:t>
       </w:r>
     </w:p>
     <w:p>
-      <w:pPr>
-        <w:pStyle w:val="Heading2"/>
-        <w:spacing w:before="100" w:after="20"/>
-      </w:pPr>
       <w:r>
+        <w:rPr>
+          <w:rFonts w:ascii="微软雅黑" w:hAnsi="微软雅黑" w:eastAsia="微软雅黑"/>
+          <w:b/>
+          <w:color w:val="1F3A5F"/>
+          <w:sz w:val="28"/>
+        </w:rPr>
         <w:t>4. Decisions Needed From Supervisor</w:t>
       </w:r>
     </w:p>
     <w:p>
       <w:pPr>
         <w:pStyle w:val="ListBullet"/>
-        <w:spacing w:after="0"/>
-        <w:ind w:left="216"/>
       </w:pPr>
       <w:r>
+        <w:rPr>
+          <w:rFonts w:ascii="微软雅黑" w:hAnsi="微软雅黑" w:eastAsia="微软雅黑"/>
+        </w:rPr>
         <w:t>Should the thesis main claim focus on "strict direct transfer fails, small target-domain intermediate fine-tuning helps"?</w:t>
       </w:r>
     </w:p>
     <w:p>
       <w:pPr>
         <w:pStyle w:val="ListBullet"/>
-        <w:spacing w:after="0"/>
-        <w:ind w:left="216"/>
       </w:pPr>
       <w:r>
+        <w:rPr>
+          <w:rFonts w:ascii="微软雅黑" w:hAnsi="微软雅黑" w:eastAsia="微软雅黑"/>
+        </w:rPr>
         <w:t>Should I frame the main intermediate fine-tuning claim around 10% efficiency, 20% best absolute performance, or show both as complementary?</w:t>
       </w:r>
     </w:p>
     <w:p>
       <w:pPr>
         <w:pStyle w:val="ListBullet"/>
-        <w:spacing w:after="0"/>
-        <w:ind w:left="216"/>
       </w:pPr>
       <w:r>
+        <w:rPr>
+          <w:rFonts w:ascii="微软雅黑" w:hAnsi="微软雅黑" w:eastAsia="微软雅黑"/>
+        </w:rPr>
         <w:t>Should the 1000-row LLM/DeepSeek atom pilot remain in Chapter 6 as a short supporting analysis, or move mostly to future work / appendix?</w:t>
       </w:r>
     </w:p>
     <w:p>
       <w:pPr>
         <w:pStyle w:val="ListBullet"/>
-        <w:spacing w:after="0"/>
-        <w:ind w:left="216"/>
       </w:pPr>
       <w:r>
+        <w:rPr>
+          <w:rFonts w:ascii="微软雅黑" w:hAnsi="微软雅黑" w:eastAsia="微软雅黑"/>
+        </w:rPr>
         <w:t>Is Chapter 2/3 now clear enough as the supervisor-facing reading package, or should I reduce the literature review further before sending the full dissertation draft?</w:t>
       </w:r>
     </w:p>
     <w:p>
-      <w:pPr>
-        <w:spacing w:after="20"/>
-      </w:pPr>
       <w:r>
+        <w:rPr>
+          <w:rFonts w:ascii="微软雅黑" w:hAnsi="微软雅黑" w:eastAsia="微软雅黑"/>
+        </w:rPr>
         <w:t>Files ready for the meeting:</w:t>
       </w:r>
     </w:p>
     <w:p>
       <w:pPr>
         <w:pStyle w:val="ListBullet"/>
-        <w:spacing w:after="0"/>
-        <w:ind w:left="216"/>
       </w:pPr>
       <w:r>
-        <w:t>Chapter 2/3 supervisor version: `thesis_writeup/supervisor_materials_20260530/supervisor_ch2_ch3_results_2026-05-30.pdf`</w:t>
+        <w:rPr>
+          <w:rFonts w:ascii="微软雅黑" w:hAnsi="微软雅黑" w:eastAsia="微软雅黑"/>
+        </w:rPr>
+        <w:t xml:space="preserve">Chapter 2/3 supervisor version: </w:t>
+      </w:r>
+      <w:r>
+        <w:rPr>
+          <w:rFonts w:ascii="Consolas" w:hAnsi="Consolas" w:eastAsia="Consolas"/>
+          <w:color w:val="B03030"/>
+        </w:rPr>
+        <w:t>thesis_writeup/supervisor_materials_20260530/supervisor_ch2_ch3_results_2026-05-30.pdf</w:t>
       </w:r>
     </w:p>
     <w:p>
       <w:pPr>
         <w:pStyle w:val="ListBullet"/>
-        <w:spacing w:after="0"/>
-        <w:ind w:left="216"/>
       </w:pPr>
       <w:r>
-        <w:t>Updated integrated result table: `results/integrated_experiment_summary/integrated_main_results_table.md`</w:t>
+        <w:rPr>
+          <w:rFonts w:ascii="微软雅黑" w:hAnsi="微软雅黑" w:eastAsia="微软雅黑"/>
+        </w:rPr>
+        <w:t xml:space="preserve">Updated integrated result table: </w:t>
+      </w:r>
+      <w:r>
+        <w:rPr>
+          <w:rFonts w:ascii="Consolas" w:hAnsi="Consolas" w:eastAsia="Consolas"/>
+          <w:color w:val="B03030"/>
+        </w:rPr>
+        <w:t>results/integrated_experiment_summary/integrated_main_results_table.md</w:t>
       </w:r>
     </w:p>
     <w:p>
       <w:pPr>
         <w:pStyle w:val="ListBullet"/>
-        <w:spacing w:after="0"/>
-        <w:ind w:left="216"/>
       </w:pPr>
       <w:r>
-        <w:t>Internal Chapter 6 rerun note: `thesis_writeup/supervisor_materials_20260530/chapter6_internal_rerun_update_2026-05-30.md`</w:t>
+        <w:rPr>
+          <w:rFonts w:ascii="微软雅黑" w:hAnsi="微软雅黑" w:eastAsia="微软雅黑"/>
+        </w:rPr>
+        <w:t xml:space="preserve">Internal Chapter 6 rerun note: </w:t>
+      </w:r>
+      <w:r>
+        <w:rPr>
+          <w:rFonts w:ascii="Consolas" w:hAnsi="Consolas" w:eastAsia="Consolas"/>
+          <w:color w:val="B03030"/>
+        </w:rPr>
+        <w:t>thesis_writeup/supervisor_materials_20260530/chapter6_internal_rerun_update_2026-05-30.md</w:t>
       </w:r>
     </w:p>
     <w:sectPr>
       <w:pgSz w:w="12240" w:h="15840"/>
-      <w:pgMar w:top="648" w:right="792" w:bottom="648" w:left="792" w:header="720" w:footer="720" w:gutter="0"/>
+      <w:pgMar w:top="1440" w:right="1800" w:bottom="1440" w:left="1800" w:header="720" w:footer="720" w:gutter="0"/>
       <w:cols w:space="720"/>
       <w:docGrid w:linePitch="360"/>
     </w:sectPr>
@@ -655,8 +718,8 @@
     <w:qFormat/>
     <w:rsid w:val="00FC693F"/>
     <w:rPr>
-      <w:rFonts w:ascii="Arial" w:hAnsi="Arial"/>
-      <w:sz w:val="17"/>
+      <w:rFonts w:ascii="微软雅黑" w:hAnsi="微软雅黑" w:eastAsia="微软雅黑"/>
+      <w:sz w:val="21"/>
     </w:rPr>
   </w:style>
   <w:style w:type="paragraph" w:styleId="Header">
@@ -718,11 +781,11 @@
       <w:outlineLvl w:val="0"/>
     </w:pPr>
     <w:rPr>
-      <w:rFonts w:asciiTheme="majorHAnsi" w:eastAsiaTheme="majorEastAsia" w:hAnsiTheme="majorHAnsi" w:cstheme="majorBidi" w:ascii="Arial" w:hAnsi="Arial"/>
+      <w:rFonts w:asciiTheme="majorHAnsi" w:eastAsiaTheme="majorEastAsia" w:hAnsiTheme="majorHAnsi" w:cstheme="majorBidi"/>
       <w:b/>
       <w:bCs/>
       <w:color w:val="365F91" w:themeColor="accent1" w:themeShade="BF"/>
-      <w:sz w:val="22"/>
+      <w:sz w:val="28"/>
       <w:szCs w:val="28"/>
     </w:rPr>
   </w:style>
@@ -742,11 +805,11 @@
       <w:outlineLvl w:val="1"/>
     </w:pPr>
     <w:rPr>
-      <w:rFonts w:asciiTheme="majorHAnsi" w:eastAsiaTheme="majorEastAsia" w:hAnsiTheme="majorHAnsi" w:cstheme="majorBidi" w:ascii="Arial" w:hAnsi="Arial"/>
+      <w:rFonts w:asciiTheme="majorHAnsi" w:eastAsiaTheme="majorEastAsia" w:hAnsiTheme="majorHAnsi" w:cstheme="majorBidi"/>
       <w:b/>
       <w:bCs/>
       <w:color w:val="4F81BD" w:themeColor="accent1"/>
-      <w:sz w:val="20"/>
+      <w:sz w:val="26"/>
       <w:szCs w:val="26"/>
     </w:rPr>
   </w:style>
@@ -1007,11 +1070,11 @@
       <w:contextualSpacing/>
     </w:pPr>
     <w:rPr>
-      <w:rFonts w:asciiTheme="majorHAnsi" w:eastAsiaTheme="majorEastAsia" w:hAnsiTheme="majorHAnsi" w:cstheme="majorBidi" w:ascii="Arial" w:hAnsi="Arial"/>
+      <w:rFonts w:asciiTheme="majorHAnsi" w:eastAsiaTheme="majorEastAsia" w:hAnsiTheme="majorHAnsi" w:cstheme="majorBidi"/>
       <w:color w:val="17365D" w:themeColor="text2" w:themeShade="BF"/>
       <w:spacing w:val="5"/>
       <w:kern w:val="28"/>
-      <w:sz w:val="30"/>
+      <w:sz w:val="52"/>
       <w:szCs w:val="52"/>
     </w:rPr>
   </w:style>

</xml_diff>